<commit_message>
Added steps 1 to 9
</commit_message>
<xml_diff>
--- a/GIT.docx
+++ b/GIT.docx
@@ -205,7 +205,17 @@
     </w:p>
     <w:p>
       <w:r>
-        <w:t xml:space="preserve">Version control systems are mainly used for collaboration between team members and for </w:t>
+        <w:t xml:space="preserve">Version control systems are mainly used for </w:t>
+      </w:r>
+      <w:r>
+        <w:rPr>
+          <w:b/>
+          <w:bCs/>
+        </w:rPr>
+        <w:t>collaboration</w:t>
+      </w:r>
+      <w:r>
+        <w:t xml:space="preserve"> between team members and for </w:t>
       </w:r>
       <w:r>
         <w:rPr>
@@ -279,13 +289,8 @@
     </w:p>
     <w:p>
       <w:r>
-        <w:t xml:space="preserve">So, if the central server fails, all the project code is gone.  – Ex: SVN, CVS, </w:t>
-      </w:r>
-      <w:proofErr w:type="gramStart"/>
-      <w:r>
-        <w:t>ClearCase..</w:t>
-      </w:r>
-      <w:proofErr w:type="gramEnd"/>
+        <w:t>So, if the central server fails, all the project code is gone.  – Ex: SVN, CVS, ClearCase..</w:t>
+      </w:r>
     </w:p>
     <w:p>
       <w:pPr>
@@ -319,15 +324,7 @@
     </w:p>
     <w:p>
       <w:r>
-        <w:t xml:space="preserve">So, </w:t>
-      </w:r>
-      <w:proofErr w:type="gramStart"/>
-      <w:r>
-        <w:t>its</w:t>
-      </w:r>
-      <w:proofErr w:type="gramEnd"/>
-      <w:r>
-        <w:t xml:space="preserve"> called distributed. Even of the central server fails, code is safe. Ex: Git</w:t>
+        <w:t>So, its called distributed. Even of the central server fails, code is safe. Ex: Git</w:t>
       </w:r>
     </w:p>
     <w:p>
@@ -461,15 +458,7 @@
         <w:t>Go to</w:t>
       </w:r>
       <w:r>
-        <w:t xml:space="preserve"> command prompt and </w:t>
-      </w:r>
-      <w:proofErr w:type="gramStart"/>
-      <w:r>
-        <w:t>say</w:t>
-      </w:r>
-      <w:proofErr w:type="gramEnd"/>
-      <w:r>
-        <w:t xml:space="preserve"> </w:t>
+        <w:t xml:space="preserve"> command prompt and say </w:t>
       </w:r>
     </w:p>
     <w:p>
@@ -579,46 +568,18 @@
         <w:rPr>
           <w:highlight w:val="cyan"/>
         </w:rPr>
-        <w:t>git config --global user.name “</w:t>
-      </w:r>
-      <w:proofErr w:type="spellStart"/>
+        <w:t>git config --global user.name “sreelatha.techie”</w:t>
+      </w:r>
+    </w:p>
+    <w:p>
+      <w:pPr>
+        <w:ind w:left="360"/>
+      </w:pPr>
       <w:r>
         <w:rPr>
           <w:highlight w:val="cyan"/>
         </w:rPr>
-        <w:t>sreelatha.techie</w:t>
-      </w:r>
-      <w:proofErr w:type="spellEnd"/>
-      <w:r>
-        <w:rPr>
-          <w:highlight w:val="cyan"/>
-        </w:rPr>
-        <w:t>”</w:t>
-      </w:r>
-    </w:p>
-    <w:p>
-      <w:pPr>
-        <w:ind w:left="360"/>
-      </w:pPr>
-      <w:r>
-        <w:rPr>
-          <w:highlight w:val="cyan"/>
-        </w:rPr>
-        <w:t xml:space="preserve">git config –global </w:t>
-      </w:r>
-      <w:proofErr w:type="spellStart"/>
-      <w:r>
-        <w:rPr>
-          <w:highlight w:val="cyan"/>
-        </w:rPr>
-        <w:t>user.email</w:t>
-      </w:r>
-      <w:proofErr w:type="spellEnd"/>
-      <w:r>
-        <w:rPr>
-          <w:highlight w:val="cyan"/>
-        </w:rPr>
-        <w:t xml:space="preserve"> </w:t>
+        <w:t xml:space="preserve">git config –global user.email </w:t>
       </w:r>
       <w:hyperlink r:id="rId5" w:history="1">
         <w:r>
@@ -647,19 +608,7 @@
         <w:rPr>
           <w:color w:val="EE0000"/>
         </w:rPr>
-        <w:t xml:space="preserve"> the email should match your GitHub account email:</w:t>
-      </w:r>
-      <w:r>
-        <w:rPr>
-          <w:color w:val="EE0000"/>
-        </w:rPr>
-        <w:t xml:space="preserve"> </w:t>
-      </w:r>
-      <w:r>
-        <w:rPr>
-          <w:color w:val="EE0000"/>
-        </w:rPr>
-        <w:t>Then GitHub can link commits to your profile correctly.</w:t>
+        <w:t xml:space="preserve"> the email should match your GitHub account email: Then GitHub can link commits to your profile correctly.</w:t>
       </w:r>
     </w:p>
     <w:p>
@@ -779,6 +728,34 @@
         </w:rPr>
         <w:t>Working Directory  →  Staging Area  →  Repository</w:t>
       </w:r>
+      <w:r>
+        <w:rPr>
+          <w:b/>
+          <w:bCs/>
+        </w:rPr>
+        <w:t xml:space="preserve"> </w:t>
+      </w:r>
+      <w:r>
+        <w:rPr>
+          <w:b/>
+          <w:bCs/>
+        </w:rPr>
+        <w:t>→</w:t>
+      </w:r>
+      <w:r>
+        <w:rPr>
+          <w:b/>
+          <w:bCs/>
+        </w:rPr>
+        <w:t xml:space="preserve"> Remote Repository</w:t>
+      </w:r>
+      <w:r>
+        <w:rPr>
+          <w:b/>
+          <w:bCs/>
+        </w:rPr>
+        <w:t>(github)</w:t>
+      </w:r>
     </w:p>
     <w:p>
       <w:pPr>
@@ -834,42 +811,205 @@
         <w:t>:</w:t>
       </w:r>
       <w:r>
+        <w:t xml:space="preserve"> When you run:</w:t>
+      </w:r>
+      <w:r>
         <w:t xml:space="preserve"> </w:t>
       </w:r>
-      <w:r>
-        <w:t>When you run:</w:t>
+    </w:p>
+    <w:p>
+      <w:pPr>
+        <w:ind w:left="360"/>
+      </w:pPr>
+      <w:r>
+        <w:rPr>
+          <w:highlight w:val="cyan"/>
+        </w:rPr>
+        <w:t>g</w:t>
+      </w:r>
+      <w:r>
+        <w:rPr>
+          <w:highlight w:val="cyan"/>
+        </w:rPr>
+        <w:t>it add filename</w:t>
       </w:r>
       <w:r>
         <w:t xml:space="preserve"> </w:t>
       </w:r>
+      <w:r>
+        <w:rPr>
+          <w:highlight w:val="cyan"/>
+        </w:rPr>
+        <w:t>git add .</w:t>
+      </w:r>
+      <w:r>
+        <w:t xml:space="preserve"> (add all files in current directory to staging)</w:t>
+      </w:r>
     </w:p>
     <w:p>
       <w:pPr>
         <w:ind w:left="360"/>
       </w:pPr>
       <w:r>
+        <w:t xml:space="preserve">the file moves to the </w:t>
+      </w:r>
+      <w:r>
+        <w:rPr>
+          <w:b/>
+          <w:bCs/>
+        </w:rPr>
+        <w:t>staging area</w:t>
+      </w:r>
+      <w:r>
+        <w:t>.</w:t>
+      </w:r>
+      <w:r>
+        <w:t xml:space="preserve"> </w:t>
+      </w:r>
+      <w:r>
+        <w:t>Meaning:</w:t>
+      </w:r>
+      <w:r>
+        <w:t xml:space="preserve"> </w:t>
+      </w:r>
+      <w:r>
+        <w:t>“Git, prepare this file for the next commit.”</w:t>
+      </w:r>
+    </w:p>
+    <w:p>
+      <w:pPr>
+        <w:ind w:left="360"/>
+      </w:pPr>
+      <w:r>
+        <w:rPr>
+          <w:b/>
+          <w:bCs/>
+        </w:rPr>
+        <w:t xml:space="preserve">3. </w:t>
+      </w:r>
+      <w:r>
+        <w:rPr>
+          <w:b/>
+          <w:bCs/>
+        </w:rPr>
+        <w:t>Repository</w:t>
+      </w:r>
+      <w:r>
+        <w:t xml:space="preserve"> </w:t>
+      </w:r>
+      <w:r>
+        <w:t>:</w:t>
+      </w:r>
+      <w:r>
+        <w:t>When you commit:</w:t>
+      </w:r>
+    </w:p>
+    <w:p>
+      <w:pPr>
+        <w:ind w:left="360"/>
+      </w:pPr>
+      <w:r>
         <w:rPr>
           <w:highlight w:val="cyan"/>
         </w:rPr>
-        <w:t>g</w:t>
+        <w:t>git commit -m "Updated App</w:t>
       </w:r>
       <w:r>
         <w:rPr>
           <w:highlight w:val="cyan"/>
         </w:rPr>
-        <w:t>it add filename</w:t>
+        <w:t xml:space="preserve"> ticket Number</w:t>
+      </w:r>
+      <w:r>
+        <w:rPr>
+          <w:highlight w:val="cyan"/>
+        </w:rPr>
+        <w:t>"</w:t>
+      </w:r>
+    </w:p>
+    <w:p>
+      <w:pPr>
+        <w:ind w:left="360"/>
+      </w:pPr>
+      <w:r>
+        <w:t xml:space="preserve">Git permanently saves the staged changes into </w:t>
+      </w:r>
+      <w:r>
+        <w:t xml:space="preserve">local </w:t>
+      </w:r>
+      <w:r>
+        <w:t>repository history.</w:t>
+      </w:r>
+    </w:p>
+    <w:p>
+      <w:pPr>
+        <w:ind w:left="360"/>
+      </w:pPr>
+      <w:r>
+        <w:rPr>
+          <w:b/>
+          <w:bCs/>
+        </w:rPr>
+        <w:t>4</w:t>
+      </w:r>
+      <w:r>
+        <w:rPr>
+          <w:b/>
+          <w:bCs/>
+        </w:rPr>
+        <w:t xml:space="preserve">. </w:t>
+      </w:r>
+      <w:r>
+        <w:rPr>
+          <w:b/>
+          <w:bCs/>
+        </w:rPr>
+        <w:t xml:space="preserve">Remote </w:t>
+      </w:r>
+      <w:r>
+        <w:rPr>
+          <w:b/>
+          <w:bCs/>
+        </w:rPr>
+        <w:t>Repository</w:t>
       </w:r>
       <w:r>
         <w:t xml:space="preserve"> </w:t>
       </w:r>
       <w:r>
+        <w:t>:</w:t>
+      </w:r>
+      <w:r>
+        <w:t xml:space="preserve">When you </w:t>
+      </w:r>
+      <w:r>
+        <w:t>push</w:t>
+      </w:r>
+      <w:r>
+        <w:t>:</w:t>
+      </w:r>
+    </w:p>
+    <w:p>
+      <w:pPr>
+        <w:ind w:left="360"/>
+      </w:pPr>
+      <w:r>
         <w:rPr>
           <w:highlight w:val="cyan"/>
         </w:rPr>
-        <w:t>git add .</w:t>
-      </w:r>
-      <w:r>
-        <w:t xml:space="preserve"> (add all files in current directory to staging)</w:t>
+        <w:t>Git push origin localBranchName</w:t>
+      </w:r>
+      <w:r>
+        <w:t xml:space="preserve"> Here origin is the alias name we gave to remote repository using </w:t>
+      </w:r>
+      <w:r>
+        <w:rPr>
+          <w:highlight w:val="cyan"/>
+        </w:rPr>
+        <w:t>git remote add origin gitHubRepoURL</w:t>
+      </w:r>
+      <w:r>
+        <w:t xml:space="preserve"> . It can be any name not just origin. With this, git creates a mapping like origin = gitHubRepo</w:t>
       </w:r>
     </w:p>
     <w:p>
@@ -877,29 +1017,31 @@
         <w:ind w:left="360"/>
       </w:pPr>
       <w:r>
-        <w:t xml:space="preserve">the file moves to the </w:t>
-      </w:r>
-      <w:r>
-        <w:rPr>
-          <w:b/>
-          <w:bCs/>
-        </w:rPr>
-        <w:t>staging area</w:t>
-      </w:r>
-      <w:r>
-        <w:t>.</w:t>
-      </w:r>
-      <w:r>
-        <w:t xml:space="preserve"> </w:t>
-      </w:r>
-      <w:r>
-        <w:t>Meaning:</w:t>
-      </w:r>
-      <w:r>
-        <w:t xml:space="preserve"> </w:t>
-      </w:r>
-      <w:r>
-        <w:t>“Git, prepare this file for the next commit.”</w:t>
+        <w:t xml:space="preserve">We should use localBranchName in push command, not directory name. Because works with branches and has no idea of working directories. If we want git to remember the remote and local branch that are mapped (like origin, </w:t>
+      </w:r>
+      <w:r>
+        <w:t>localBranchName</w:t>
+      </w:r>
+      <w:r>
+        <w:t xml:space="preserve">) and don’t want to use both in push command every time we push changes then use -u (upstream) for first push . Then git remembers that and next time onwards just run </w:t>
+      </w:r>
+      <w:r>
+        <w:rPr>
+          <w:highlight w:val="cyan"/>
+        </w:rPr>
+        <w:t>git push</w:t>
+      </w:r>
+      <w:r>
+        <w:t xml:space="preserve"> or </w:t>
+      </w:r>
+      <w:r>
+        <w:rPr>
+          <w:highlight w:val="cyan"/>
+        </w:rPr>
+        <w:t>git pull</w:t>
+      </w:r>
+      <w:r>
+        <w:t xml:space="preserve"> like</w:t>
       </w:r>
     </w:p>
     <w:p>
@@ -908,26 +1050,21 @@
       </w:pPr>
       <w:r>
         <w:rPr>
-          <w:b/>
-          <w:bCs/>
-        </w:rPr>
-        <w:t xml:space="preserve">3. </w:t>
-      </w:r>
-      <w:r>
-        <w:rPr>
-          <w:b/>
-          <w:bCs/>
-        </w:rPr>
-        <w:t>Repository</w:t>
-      </w:r>
-      <w:r>
-        <w:t xml:space="preserve"> </w:t>
-      </w:r>
-      <w:r>
-        <w:t>:</w:t>
-      </w:r>
-      <w:r>
-        <w:t>When you commit:</w:t>
+          <w:highlight w:val="cyan"/>
+        </w:rPr>
+        <w:t xml:space="preserve">Git push </w:t>
+      </w:r>
+      <w:r>
+        <w:rPr>
+          <w:highlight w:val="cyan"/>
+        </w:rPr>
+        <w:t xml:space="preserve">-u </w:t>
+      </w:r>
+      <w:r>
+        <w:rPr>
+          <w:highlight w:val="cyan"/>
+        </w:rPr>
+        <w:t>origin localBranchName</w:t>
       </w:r>
     </w:p>
     <w:p>
@@ -935,31 +1072,27 @@
         <w:ind w:left="360"/>
       </w:pPr>
       <w:r>
+        <w:t xml:space="preserve">Then , just </w:t>
+      </w:r>
+    </w:p>
+    <w:p>
+      <w:pPr>
+        <w:ind w:left="360"/>
+      </w:pPr>
+      <w:r>
         <w:rPr>
           <w:highlight w:val="cyan"/>
         </w:rPr>
-        <w:t>git commit -m "Updated App</w:t>
-      </w:r>
-      <w:r>
-        <w:rPr>
-          <w:highlight w:val="cyan"/>
-        </w:rPr>
-        <w:t xml:space="preserve"> ticket Number</w:t>
-      </w:r>
-      <w:r>
-        <w:rPr>
-          <w:highlight w:val="cyan"/>
-        </w:rPr>
-        <w:t>"</w:t>
+        <w:t>git push/pull</w:t>
+      </w:r>
+      <w:r>
+        <w:t xml:space="preserve"> works fine.</w:t>
       </w:r>
     </w:p>
     <w:p>
       <w:pPr>
         <w:ind w:left="360"/>
       </w:pPr>
-      <w:r>
-        <w:t>Git permanently saves the staged changes into repository history.</w:t>
-      </w:r>
     </w:p>
     <w:p>
       <w:pPr>
@@ -971,6 +1104,7 @@
           <w:bCs/>
           <w:u w:val="single"/>
         </w:rPr>
+        <w:lastRenderedPageBreak/>
         <w:t>Why this staging area is important</w:t>
       </w:r>
       <w:r>
@@ -1088,35 +1222,32 @@
         <w:rPr>
           <w:highlight w:val="cyan"/>
         </w:rPr>
-        <w:t xml:space="preserve">git </w:t>
-      </w:r>
-      <w:proofErr w:type="spellStart"/>
-      <w:r>
-        <w:rPr>
-          <w:highlight w:val="cyan"/>
-        </w:rPr>
-        <w:t>init</w:t>
-      </w:r>
-      <w:proofErr w:type="spellEnd"/>
-      <w:r>
-        <w:t xml:space="preserve"> to initialise git repository in the current project path. </w:t>
-      </w:r>
-      <w:r>
-        <w:t xml:space="preserve">It tells Git start tracking this project. </w:t>
-      </w:r>
-      <w:r>
-        <w:t xml:space="preserve">Then it will </w:t>
-      </w:r>
-      <w:proofErr w:type="gramStart"/>
-      <w:r>
-        <w:t>create</w:t>
-      </w:r>
-      <w:r>
-        <w:t>s</w:t>
-      </w:r>
-      <w:proofErr w:type="gramEnd"/>
-      <w:r>
-        <w:t xml:space="preserve"> hidden </w:t>
+        <w:t>git init</w:t>
+      </w:r>
+      <w:r>
+        <w:t xml:space="preserve"> to initialise </w:t>
+      </w:r>
+      <w:r>
+        <w:t xml:space="preserve">local </w:t>
+      </w:r>
+      <w:r>
+        <w:t xml:space="preserve">git repository in the current project path. </w:t>
+      </w:r>
+      <w:r>
+        <w:rPr>
+          <w:b/>
+          <w:bCs/>
+        </w:rPr>
+        <w:t>It tells Git start tracking this project</w:t>
+      </w:r>
+      <w:r>
+        <w:t xml:space="preserve">. </w:t>
+      </w:r>
+      <w:r>
+        <w:t>Then it will create</w:t>
+      </w:r>
+      <w:r>
+        <w:t xml:space="preserve">s hidden </w:t>
       </w:r>
       <w:r>
         <w:rPr>
@@ -1126,11 +1257,7 @@
         <w:t>.git</w:t>
       </w:r>
       <w:r>
-        <w:t xml:space="preserve"> file in </w:t>
-      </w:r>
-      <w:r>
-        <w:lastRenderedPageBreak/>
-        <w:t xml:space="preserve">the </w:t>
+        <w:t xml:space="preserve"> file in the </w:t>
       </w:r>
       <w:r>
         <w:t xml:space="preserve">project </w:t>
@@ -1192,25 +1319,7 @@
           <w:bCs/>
           <w:u w:val="single"/>
         </w:rPr>
-        <w:t xml:space="preserve">Difference Between git </w:t>
-      </w:r>
-      <w:proofErr w:type="spellStart"/>
-      <w:r>
-        <w:rPr>
-          <w:b/>
-          <w:bCs/>
-          <w:u w:val="single"/>
-        </w:rPr>
-        <w:t>init</w:t>
-      </w:r>
-      <w:proofErr w:type="spellEnd"/>
-      <w:r>
-        <w:rPr>
-          <w:b/>
-          <w:bCs/>
-          <w:u w:val="single"/>
-        </w:rPr>
-        <w:t xml:space="preserve"> and git clone</w:t>
+        <w:t>Difference Between git init and git clone</w:t>
       </w:r>
     </w:p>
     <w:tbl>
@@ -1307,13 +1416,8 @@
           </w:tcPr>
           <w:p>
             <w:r>
-              <w:t xml:space="preserve">git </w:t>
+              <w:t>git init</w:t>
             </w:r>
-            <w:proofErr w:type="spellStart"/>
-            <w:r>
-              <w:t>init</w:t>
-            </w:r>
-            <w:proofErr w:type="spellEnd"/>
           </w:p>
         </w:tc>
         <w:tc>
@@ -1324,7 +1428,17 @@
           </w:tcPr>
           <w:p>
             <w:r>
-              <w:t>Create new local repository</w:t>
+              <w:t xml:space="preserve">Create new </w:t>
+            </w:r>
+            <w:r>
+              <w:rPr>
+                <w:b/>
+                <w:bCs/>
+              </w:rPr>
+              <w:t>local</w:t>
+            </w:r>
+            <w:r>
+              <w:t xml:space="preserve"> repository</w:t>
             </w:r>
           </w:p>
         </w:tc>
@@ -1342,6 +1456,9 @@
           <w:p>
             <w:r>
               <w:t>git clone</w:t>
+            </w:r>
+            <w:r>
+              <w:t xml:space="preserve"> url</w:t>
             </w:r>
           </w:p>
         </w:tc>
@@ -1449,7 +1566,14 @@
         <w:t>log</w:t>
       </w:r>
       <w:r>
-        <w:t xml:space="preserve"> is used to get all commit history</w:t>
+        <w:t xml:space="preserve"> is used to get all </w:t>
+      </w:r>
+      <w:r>
+        <w:rPr>
+          <w:b/>
+          <w:bCs/>
+        </w:rPr>
+        <w:t>commit history</w:t>
       </w:r>
     </w:p>
     <w:p>
@@ -1476,10 +1600,353 @@
       <w:pPr>
         <w:ind w:left="360"/>
       </w:pPr>
-    </w:p>
-    <w:p>
-      <w:pPr>
-        <w:ind w:left="360"/>
+      <w:r>
+        <w:rPr>
+          <w:b/>
+          <w:bCs/>
+          <w:u w:val="single"/>
+        </w:rPr>
+        <w:t>Steps:</w:t>
+      </w:r>
+    </w:p>
+    <w:p>
+      <w:r>
+        <w:rPr>
+          <w:b/>
+          <w:bCs/>
+        </w:rPr>
+        <w:t xml:space="preserve">       </w:t>
+      </w:r>
+      <w:r>
+        <w:rPr>
+          <w:b/>
+          <w:bCs/>
+        </w:rPr>
+        <w:t>1. Create working directory</w:t>
+      </w:r>
+      <w:r>
+        <w:rPr>
+          <w:b/>
+          <w:bCs/>
+        </w:rPr>
+        <w:t xml:space="preserve"> : </w:t>
+      </w:r>
+      <w:r>
+        <w:t>Say</w:t>
+      </w:r>
+      <w:r>
+        <w:t xml:space="preserve">, </w:t>
+      </w:r>
+      <w:r>
+        <w:t>CourseMaterials</w:t>
+      </w:r>
+    </w:p>
+    <w:p>
+      <w:r>
+        <w:rPr>
+          <w:b/>
+          <w:bCs/>
+        </w:rPr>
+        <w:t xml:space="preserve">       </w:t>
+      </w:r>
+      <w:r>
+        <w:rPr>
+          <w:b/>
+          <w:bCs/>
+        </w:rPr>
+        <w:t>2. Go inside folder</w:t>
+      </w:r>
+      <w:r>
+        <w:rPr>
+          <w:b/>
+          <w:bCs/>
+        </w:rPr>
+        <w:t xml:space="preserve"> : </w:t>
+      </w:r>
+      <w:r>
+        <w:t>cd CourseMaterials</w:t>
+      </w:r>
+    </w:p>
+    <w:p>
+      <w:r>
+        <w:rPr>
+          <w:b/>
+          <w:bCs/>
+        </w:rPr>
+        <w:t xml:space="preserve">       </w:t>
+      </w:r>
+      <w:r>
+        <w:rPr>
+          <w:b/>
+          <w:bCs/>
+        </w:rPr>
+        <w:t>3. Initialize Git</w:t>
+      </w:r>
+      <w:r>
+        <w:rPr>
+          <w:b/>
+          <w:bCs/>
+        </w:rPr>
+        <w:t xml:space="preserve"> : </w:t>
+      </w:r>
+      <w:r>
+        <w:t>git init</w:t>
+      </w:r>
+    </w:p>
+    <w:p>
+      <w:r>
+        <w:rPr>
+          <w:b/>
+          <w:bCs/>
+        </w:rPr>
+        <w:t xml:space="preserve">       </w:t>
+      </w:r>
+      <w:r>
+        <w:rPr>
+          <w:b/>
+          <w:bCs/>
+        </w:rPr>
+        <w:t>4.</w:t>
+      </w:r>
+      <w:r>
+        <w:rPr>
+          <w:b/>
+          <w:bCs/>
+        </w:rPr>
+        <w:t xml:space="preserve"> </w:t>
+      </w:r>
+      <w:r>
+        <w:rPr>
+          <w:b/>
+          <w:bCs/>
+        </w:rPr>
+        <w:t>Create GitHub repository manually</w:t>
+      </w:r>
+      <w:r>
+        <w:rPr>
+          <w:b/>
+          <w:bCs/>
+        </w:rPr>
+        <w:t xml:space="preserve"> : </w:t>
+      </w:r>
+      <w:r>
+        <w:t>Say, Learning</w:t>
+      </w:r>
+    </w:p>
+    <w:p>
+      <w:pPr>
+        <w:rPr>
+          <w:b/>
+          <w:bCs/>
+        </w:rPr>
+      </w:pPr>
+      <w:r>
+        <w:t xml:space="preserve">       </w:t>
+      </w:r>
+      <w:r>
+        <w:rPr>
+          <w:b/>
+          <w:bCs/>
+        </w:rPr>
+        <w:t>5.</w:t>
+      </w:r>
+      <w:r>
+        <w:rPr>
+          <w:b/>
+          <w:bCs/>
+        </w:rPr>
+        <w:t xml:space="preserve"> </w:t>
+      </w:r>
+      <w:r>
+        <w:rPr>
+          <w:b/>
+          <w:bCs/>
+        </w:rPr>
+        <w:t>Connect local repo to GitHub</w:t>
+      </w:r>
+      <w:r>
+        <w:rPr>
+          <w:b/>
+          <w:bCs/>
+        </w:rPr>
+        <w:t xml:space="preserve"> :</w:t>
+      </w:r>
+      <w:r>
+        <w:rPr>
+          <w:b/>
+          <w:bCs/>
+        </w:rPr>
+        <w:t xml:space="preserve"> </w:t>
+      </w:r>
+      <w:r>
+        <w:t xml:space="preserve">It </w:t>
+      </w:r>
+      <w:r>
+        <w:t>just /</w:t>
+      </w:r>
+      <w:r>
+        <w:t>only stores the remote repository URL.</w:t>
+      </w:r>
+      <w:r>
+        <w:t xml:space="preserve"> Nothing else</w:t>
+      </w:r>
+      <w:r>
+        <w:t>.</w:t>
+      </w:r>
+    </w:p>
+    <w:p>
+      <w:r>
+        <w:rPr>
+          <w:b/>
+          <w:bCs/>
+        </w:rPr>
+        <w:t xml:space="preserve">             </w:t>
+      </w:r>
+      <w:r>
+        <w:t xml:space="preserve">git remote add origin </w:t>
+      </w:r>
+      <w:r>
+        <w:t>https://github.com/Sreelatha-Vk/Learning.git</w:t>
+      </w:r>
+      <w:r>
+        <w:t xml:space="preserve"> </w:t>
+      </w:r>
+    </w:p>
+    <w:p>
+      <w:pPr>
+        <w:pStyle w:val="ListParagraph"/>
+        <w:numPr>
+          <w:ilvl w:val="0"/>
+          <w:numId w:val="9"/>
+        </w:numPr>
+        <w:spacing w:before="100" w:beforeAutospacing="1" w:after="100" w:afterAutospacing="1" w:line="240" w:lineRule="auto"/>
+        <w:outlineLvl w:val="1"/>
+      </w:pPr>
+      <w:r>
+        <w:rPr>
+          <w:b/>
+          <w:bCs/>
+        </w:rPr>
+        <w:lastRenderedPageBreak/>
+        <w:t>Create branch</w:t>
+      </w:r>
+      <w:r>
+        <w:rPr>
+          <w:b/>
+          <w:bCs/>
+        </w:rPr>
+        <w:t xml:space="preserve">: </w:t>
+      </w:r>
+      <w:r>
+        <w:t>git checkout -b coursematerial</w:t>
+      </w:r>
+      <w:r>
+        <w:t xml:space="preserve"> (default is master or main)</w:t>
+      </w:r>
+    </w:p>
+    <w:p>
+      <w:pPr>
+        <w:pStyle w:val="ListParagraph"/>
+        <w:spacing w:before="100" w:beforeAutospacing="1" w:after="100" w:afterAutospacing="1" w:line="240" w:lineRule="auto"/>
+        <w:outlineLvl w:val="1"/>
+      </w:pPr>
+    </w:p>
+    <w:p>
+      <w:pPr>
+        <w:pStyle w:val="ListParagraph"/>
+        <w:numPr>
+          <w:ilvl w:val="0"/>
+          <w:numId w:val="9"/>
+        </w:numPr>
+        <w:rPr>
+          <w:b/>
+          <w:bCs/>
+        </w:rPr>
+      </w:pPr>
+      <w:r>
+        <w:rPr>
+          <w:b/>
+          <w:bCs/>
+        </w:rPr>
+        <w:t xml:space="preserve">Add files: </w:t>
+      </w:r>
+      <w:r>
+        <w:t>git add filename</w:t>
+      </w:r>
+      <w:r>
+        <w:t xml:space="preserve"> or git add .</w:t>
+      </w:r>
+    </w:p>
+    <w:p>
+      <w:pPr>
+        <w:pStyle w:val="ListParagraph"/>
+        <w:rPr>
+          <w:b/>
+          <w:bCs/>
+        </w:rPr>
+      </w:pPr>
+    </w:p>
+    <w:p>
+      <w:pPr>
+        <w:pStyle w:val="ListParagraph"/>
+        <w:numPr>
+          <w:ilvl w:val="0"/>
+          <w:numId w:val="9"/>
+        </w:numPr>
+        <w:rPr>
+          <w:b/>
+          <w:bCs/>
+        </w:rPr>
+      </w:pPr>
+      <w:r>
+        <w:rPr>
+          <w:b/>
+          <w:bCs/>
+        </w:rPr>
+        <w:t xml:space="preserve">Commit: </w:t>
+      </w:r>
+      <w:r>
+        <w:t>git commit -m "Added course notes"</w:t>
+      </w:r>
+    </w:p>
+    <w:p>
+      <w:pPr>
+        <w:pStyle w:val="ListParagraph"/>
+        <w:rPr>
+          <w:b/>
+          <w:bCs/>
+        </w:rPr>
+      </w:pPr>
+    </w:p>
+    <w:p>
+      <w:pPr>
+        <w:pStyle w:val="ListParagraph"/>
+        <w:numPr>
+          <w:ilvl w:val="0"/>
+          <w:numId w:val="9"/>
+        </w:numPr>
+        <w:rPr>
+          <w:b/>
+          <w:bCs/>
+        </w:rPr>
+      </w:pPr>
+      <w:r>
+        <w:rPr>
+          <w:b/>
+          <w:bCs/>
+        </w:rPr>
+        <w:t xml:space="preserve">Push: </w:t>
+      </w:r>
+      <w:r>
+        <w:t>git push origin CourseMaterials</w:t>
+      </w:r>
+    </w:p>
+    <w:p>
+      <w:pPr>
+        <w:rPr>
+          <w:b/>
+          <w:bCs/>
+        </w:rPr>
       </w:pPr>
     </w:p>
     <w:p>
@@ -1624,6 +2091,97 @@
     </w:lvl>
   </w:abstractNum>
   <w:abstractNum w:abstractNumId="1" w15:restartNumberingAfterBreak="0">
+    <w:nsid w:val="1EF553B6"/>
+    <w:multiLevelType w:val="hybridMultilevel"/>
+    <w:tmpl w:val="178A7114"/>
+    <w:lvl w:ilvl="0" w:tplc="A12E01AA">
+      <w:start w:val="6"/>
+      <w:numFmt w:val="decimal"/>
+      <w:lvlText w:val="%1."/>
+      <w:lvlJc w:val="left"/>
+      <w:pPr>
+        <w:ind w:left="720" w:hanging="360"/>
+      </w:pPr>
+      <w:rPr>
+        <w:rFonts w:hint="default"/>
+        <w:b/>
+        <w:bCs/>
+      </w:rPr>
+    </w:lvl>
+    <w:lvl w:ilvl="1" w:tplc="40090019" w:tentative="1">
+      <w:start w:val="1"/>
+      <w:numFmt w:val="lowerLetter"/>
+      <w:lvlText w:val="%2."/>
+      <w:lvlJc w:val="left"/>
+      <w:pPr>
+        <w:ind w:left="1440" w:hanging="360"/>
+      </w:pPr>
+    </w:lvl>
+    <w:lvl w:ilvl="2" w:tplc="4009001B" w:tentative="1">
+      <w:start w:val="1"/>
+      <w:numFmt w:val="lowerRoman"/>
+      <w:lvlText w:val="%3."/>
+      <w:lvlJc w:val="right"/>
+      <w:pPr>
+        <w:ind w:left="2160" w:hanging="180"/>
+      </w:pPr>
+    </w:lvl>
+    <w:lvl w:ilvl="3" w:tplc="4009000F" w:tentative="1">
+      <w:start w:val="1"/>
+      <w:numFmt w:val="decimal"/>
+      <w:lvlText w:val="%4."/>
+      <w:lvlJc w:val="left"/>
+      <w:pPr>
+        <w:ind w:left="2880" w:hanging="360"/>
+      </w:pPr>
+    </w:lvl>
+    <w:lvl w:ilvl="4" w:tplc="40090019" w:tentative="1">
+      <w:start w:val="1"/>
+      <w:numFmt w:val="lowerLetter"/>
+      <w:lvlText w:val="%5."/>
+      <w:lvlJc w:val="left"/>
+      <w:pPr>
+        <w:ind w:left="3600" w:hanging="360"/>
+      </w:pPr>
+    </w:lvl>
+    <w:lvl w:ilvl="5" w:tplc="4009001B" w:tentative="1">
+      <w:start w:val="1"/>
+      <w:numFmt w:val="lowerRoman"/>
+      <w:lvlText w:val="%6."/>
+      <w:lvlJc w:val="right"/>
+      <w:pPr>
+        <w:ind w:left="4320" w:hanging="180"/>
+      </w:pPr>
+    </w:lvl>
+    <w:lvl w:ilvl="6" w:tplc="4009000F" w:tentative="1">
+      <w:start w:val="1"/>
+      <w:numFmt w:val="decimal"/>
+      <w:lvlText w:val="%7."/>
+      <w:lvlJc w:val="left"/>
+      <w:pPr>
+        <w:ind w:left="5040" w:hanging="360"/>
+      </w:pPr>
+    </w:lvl>
+    <w:lvl w:ilvl="7" w:tplc="40090019" w:tentative="1">
+      <w:start w:val="1"/>
+      <w:numFmt w:val="lowerLetter"/>
+      <w:lvlText w:val="%8."/>
+      <w:lvlJc w:val="left"/>
+      <w:pPr>
+        <w:ind w:left="5760" w:hanging="360"/>
+      </w:pPr>
+    </w:lvl>
+    <w:lvl w:ilvl="8" w:tplc="4009001B" w:tentative="1">
+      <w:start w:val="1"/>
+      <w:numFmt w:val="lowerRoman"/>
+      <w:lvlText w:val="%9."/>
+      <w:lvlJc w:val="right"/>
+      <w:pPr>
+        <w:ind w:left="6480" w:hanging="180"/>
+      </w:pPr>
+    </w:lvl>
+  </w:abstractNum>
+  <w:abstractNum w:abstractNumId="2" w15:restartNumberingAfterBreak="0">
     <w:nsid w:val="2AA12DE2"/>
     <w:multiLevelType w:val="multilevel"/>
     <w:tmpl w:val="DC5E7FDE"/>
@@ -1772,7 +2330,7 @@
       </w:rPr>
     </w:lvl>
   </w:abstractNum>
-  <w:abstractNum w:abstractNumId="2" w15:restartNumberingAfterBreak="0">
+  <w:abstractNum w:abstractNumId="3" w15:restartNumberingAfterBreak="0">
     <w:nsid w:val="408167B0"/>
     <w:multiLevelType w:val="multilevel"/>
     <w:tmpl w:val="15908DA8"/>
@@ -1921,7 +2479,93 @@
       </w:rPr>
     </w:lvl>
   </w:abstractNum>
-  <w:abstractNum w:abstractNumId="3" w15:restartNumberingAfterBreak="0">
+  <w:abstractNum w:abstractNumId="4" w15:restartNumberingAfterBreak="0">
+    <w:nsid w:val="4B74617A"/>
+    <w:multiLevelType w:val="hybridMultilevel"/>
+    <w:tmpl w:val="7CCAF1DC"/>
+    <w:lvl w:ilvl="0" w:tplc="4009000F">
+      <w:start w:val="1"/>
+      <w:numFmt w:val="decimal"/>
+      <w:lvlText w:val="%1."/>
+      <w:lvlJc w:val="left"/>
+      <w:pPr>
+        <w:ind w:left="970" w:hanging="360"/>
+      </w:pPr>
+    </w:lvl>
+    <w:lvl w:ilvl="1" w:tplc="40090019" w:tentative="1">
+      <w:start w:val="1"/>
+      <w:numFmt w:val="lowerLetter"/>
+      <w:lvlText w:val="%2."/>
+      <w:lvlJc w:val="left"/>
+      <w:pPr>
+        <w:ind w:left="1690" w:hanging="360"/>
+      </w:pPr>
+    </w:lvl>
+    <w:lvl w:ilvl="2" w:tplc="4009001B" w:tentative="1">
+      <w:start w:val="1"/>
+      <w:numFmt w:val="lowerRoman"/>
+      <w:lvlText w:val="%3."/>
+      <w:lvlJc w:val="right"/>
+      <w:pPr>
+        <w:ind w:left="2410" w:hanging="180"/>
+      </w:pPr>
+    </w:lvl>
+    <w:lvl w:ilvl="3" w:tplc="4009000F" w:tentative="1">
+      <w:start w:val="1"/>
+      <w:numFmt w:val="decimal"/>
+      <w:lvlText w:val="%4."/>
+      <w:lvlJc w:val="left"/>
+      <w:pPr>
+        <w:ind w:left="3130" w:hanging="360"/>
+      </w:pPr>
+    </w:lvl>
+    <w:lvl w:ilvl="4" w:tplc="40090019" w:tentative="1">
+      <w:start w:val="1"/>
+      <w:numFmt w:val="lowerLetter"/>
+      <w:lvlText w:val="%5."/>
+      <w:lvlJc w:val="left"/>
+      <w:pPr>
+        <w:ind w:left="3850" w:hanging="360"/>
+      </w:pPr>
+    </w:lvl>
+    <w:lvl w:ilvl="5" w:tplc="4009001B" w:tentative="1">
+      <w:start w:val="1"/>
+      <w:numFmt w:val="lowerRoman"/>
+      <w:lvlText w:val="%6."/>
+      <w:lvlJc w:val="right"/>
+      <w:pPr>
+        <w:ind w:left="4570" w:hanging="180"/>
+      </w:pPr>
+    </w:lvl>
+    <w:lvl w:ilvl="6" w:tplc="4009000F" w:tentative="1">
+      <w:start w:val="1"/>
+      <w:numFmt w:val="decimal"/>
+      <w:lvlText w:val="%7."/>
+      <w:lvlJc w:val="left"/>
+      <w:pPr>
+        <w:ind w:left="5290" w:hanging="360"/>
+      </w:pPr>
+    </w:lvl>
+    <w:lvl w:ilvl="7" w:tplc="40090019" w:tentative="1">
+      <w:start w:val="1"/>
+      <w:numFmt w:val="lowerLetter"/>
+      <w:lvlText w:val="%8."/>
+      <w:lvlJc w:val="left"/>
+      <w:pPr>
+        <w:ind w:left="6010" w:hanging="360"/>
+      </w:pPr>
+    </w:lvl>
+    <w:lvl w:ilvl="8" w:tplc="4009001B" w:tentative="1">
+      <w:start w:val="1"/>
+      <w:numFmt w:val="lowerRoman"/>
+      <w:lvlText w:val="%9."/>
+      <w:lvlJc w:val="right"/>
+      <w:pPr>
+        <w:ind w:left="6730" w:hanging="180"/>
+      </w:pPr>
+    </w:lvl>
+  </w:abstractNum>
+  <w:abstractNum w:abstractNumId="5" w15:restartNumberingAfterBreak="0">
     <w:nsid w:val="4FCF7828"/>
     <w:multiLevelType w:val="multilevel"/>
     <w:tmpl w:val="B30AFA12"/>
@@ -2070,7 +2714,7 @@
       </w:rPr>
     </w:lvl>
   </w:abstractNum>
-  <w:abstractNum w:abstractNumId="4" w15:restartNumberingAfterBreak="0">
+  <w:abstractNum w:abstractNumId="6" w15:restartNumberingAfterBreak="0">
     <w:nsid w:val="59347008"/>
     <w:multiLevelType w:val="hybridMultilevel"/>
     <w:tmpl w:val="5F18B686"/>
@@ -2159,20 +2803,207 @@
       </w:pPr>
     </w:lvl>
   </w:abstractNum>
+  <w:abstractNum w:abstractNumId="7" w15:restartNumberingAfterBreak="0">
+    <w:nsid w:val="6F846BB3"/>
+    <w:multiLevelType w:val="hybridMultilevel"/>
+    <w:tmpl w:val="1BF6020A"/>
+    <w:lvl w:ilvl="0" w:tplc="4009000F">
+      <w:start w:val="1"/>
+      <w:numFmt w:val="decimal"/>
+      <w:lvlText w:val="%1."/>
+      <w:lvlJc w:val="left"/>
+      <w:pPr>
+        <w:ind w:left="1070" w:hanging="360"/>
+      </w:pPr>
+    </w:lvl>
+    <w:lvl w:ilvl="1" w:tplc="40090019" w:tentative="1">
+      <w:start w:val="1"/>
+      <w:numFmt w:val="lowerLetter"/>
+      <w:lvlText w:val="%2."/>
+      <w:lvlJc w:val="left"/>
+      <w:pPr>
+        <w:ind w:left="1790" w:hanging="360"/>
+      </w:pPr>
+    </w:lvl>
+    <w:lvl w:ilvl="2" w:tplc="4009001B" w:tentative="1">
+      <w:start w:val="1"/>
+      <w:numFmt w:val="lowerRoman"/>
+      <w:lvlText w:val="%3."/>
+      <w:lvlJc w:val="right"/>
+      <w:pPr>
+        <w:ind w:left="2510" w:hanging="180"/>
+      </w:pPr>
+    </w:lvl>
+    <w:lvl w:ilvl="3" w:tplc="4009000F" w:tentative="1">
+      <w:start w:val="1"/>
+      <w:numFmt w:val="decimal"/>
+      <w:lvlText w:val="%4."/>
+      <w:lvlJc w:val="left"/>
+      <w:pPr>
+        <w:ind w:left="3230" w:hanging="360"/>
+      </w:pPr>
+    </w:lvl>
+    <w:lvl w:ilvl="4" w:tplc="40090019" w:tentative="1">
+      <w:start w:val="1"/>
+      <w:numFmt w:val="lowerLetter"/>
+      <w:lvlText w:val="%5."/>
+      <w:lvlJc w:val="left"/>
+      <w:pPr>
+        <w:ind w:left="3950" w:hanging="360"/>
+      </w:pPr>
+    </w:lvl>
+    <w:lvl w:ilvl="5" w:tplc="4009001B" w:tentative="1">
+      <w:start w:val="1"/>
+      <w:numFmt w:val="lowerRoman"/>
+      <w:lvlText w:val="%6."/>
+      <w:lvlJc w:val="right"/>
+      <w:pPr>
+        <w:ind w:left="4670" w:hanging="180"/>
+      </w:pPr>
+    </w:lvl>
+    <w:lvl w:ilvl="6" w:tplc="4009000F" w:tentative="1">
+      <w:start w:val="1"/>
+      <w:numFmt w:val="decimal"/>
+      <w:lvlText w:val="%7."/>
+      <w:lvlJc w:val="left"/>
+      <w:pPr>
+        <w:ind w:left="5390" w:hanging="360"/>
+      </w:pPr>
+    </w:lvl>
+    <w:lvl w:ilvl="7" w:tplc="40090019" w:tentative="1">
+      <w:start w:val="1"/>
+      <w:numFmt w:val="lowerLetter"/>
+      <w:lvlText w:val="%8."/>
+      <w:lvlJc w:val="left"/>
+      <w:pPr>
+        <w:ind w:left="6110" w:hanging="360"/>
+      </w:pPr>
+    </w:lvl>
+    <w:lvl w:ilvl="8" w:tplc="4009001B" w:tentative="1">
+      <w:start w:val="1"/>
+      <w:numFmt w:val="lowerRoman"/>
+      <w:lvlText w:val="%9."/>
+      <w:lvlJc w:val="right"/>
+      <w:pPr>
+        <w:ind w:left="6830" w:hanging="180"/>
+      </w:pPr>
+    </w:lvl>
+  </w:abstractNum>
+  <w:abstractNum w:abstractNumId="8" w15:restartNumberingAfterBreak="0">
+    <w:nsid w:val="77FE136B"/>
+    <w:multiLevelType w:val="hybridMultilevel"/>
+    <w:tmpl w:val="BE36A34E"/>
+    <w:lvl w:ilvl="0" w:tplc="4009000F">
+      <w:start w:val="1"/>
+      <w:numFmt w:val="decimal"/>
+      <w:lvlText w:val="%1."/>
+      <w:lvlJc w:val="left"/>
+      <w:pPr>
+        <w:ind w:left="720" w:hanging="360"/>
+      </w:pPr>
+      <w:rPr>
+        <w:rFonts w:hint="default"/>
+      </w:rPr>
+    </w:lvl>
+    <w:lvl w:ilvl="1" w:tplc="40090019" w:tentative="1">
+      <w:start w:val="1"/>
+      <w:numFmt w:val="lowerLetter"/>
+      <w:lvlText w:val="%2."/>
+      <w:lvlJc w:val="left"/>
+      <w:pPr>
+        <w:ind w:left="1440" w:hanging="360"/>
+      </w:pPr>
+    </w:lvl>
+    <w:lvl w:ilvl="2" w:tplc="4009001B" w:tentative="1">
+      <w:start w:val="1"/>
+      <w:numFmt w:val="lowerRoman"/>
+      <w:lvlText w:val="%3."/>
+      <w:lvlJc w:val="right"/>
+      <w:pPr>
+        <w:ind w:left="2160" w:hanging="180"/>
+      </w:pPr>
+    </w:lvl>
+    <w:lvl w:ilvl="3" w:tplc="4009000F" w:tentative="1">
+      <w:start w:val="1"/>
+      <w:numFmt w:val="decimal"/>
+      <w:lvlText w:val="%4."/>
+      <w:lvlJc w:val="left"/>
+      <w:pPr>
+        <w:ind w:left="2880" w:hanging="360"/>
+      </w:pPr>
+    </w:lvl>
+    <w:lvl w:ilvl="4" w:tplc="40090019" w:tentative="1">
+      <w:start w:val="1"/>
+      <w:numFmt w:val="lowerLetter"/>
+      <w:lvlText w:val="%5."/>
+      <w:lvlJc w:val="left"/>
+      <w:pPr>
+        <w:ind w:left="3600" w:hanging="360"/>
+      </w:pPr>
+    </w:lvl>
+    <w:lvl w:ilvl="5" w:tplc="4009001B" w:tentative="1">
+      <w:start w:val="1"/>
+      <w:numFmt w:val="lowerRoman"/>
+      <w:lvlText w:val="%6."/>
+      <w:lvlJc w:val="right"/>
+      <w:pPr>
+        <w:ind w:left="4320" w:hanging="180"/>
+      </w:pPr>
+    </w:lvl>
+    <w:lvl w:ilvl="6" w:tplc="4009000F" w:tentative="1">
+      <w:start w:val="1"/>
+      <w:numFmt w:val="decimal"/>
+      <w:lvlText w:val="%7."/>
+      <w:lvlJc w:val="left"/>
+      <w:pPr>
+        <w:ind w:left="5040" w:hanging="360"/>
+      </w:pPr>
+    </w:lvl>
+    <w:lvl w:ilvl="7" w:tplc="40090019" w:tentative="1">
+      <w:start w:val="1"/>
+      <w:numFmt w:val="lowerLetter"/>
+      <w:lvlText w:val="%8."/>
+      <w:lvlJc w:val="left"/>
+      <w:pPr>
+        <w:ind w:left="5760" w:hanging="360"/>
+      </w:pPr>
+    </w:lvl>
+    <w:lvl w:ilvl="8" w:tplc="4009001B" w:tentative="1">
+      <w:start w:val="1"/>
+      <w:numFmt w:val="lowerRoman"/>
+      <w:lvlText w:val="%9."/>
+      <w:lvlJc w:val="right"/>
+      <w:pPr>
+        <w:ind w:left="6480" w:hanging="180"/>
+      </w:pPr>
+    </w:lvl>
+  </w:abstractNum>
   <w:num w:numId="1" w16cid:durableId="1674993921">
-    <w:abstractNumId w:val="2"/>
+    <w:abstractNumId w:val="3"/>
   </w:num>
   <w:num w:numId="2" w16cid:durableId="1487740393">
-    <w:abstractNumId w:val="4"/>
+    <w:abstractNumId w:val="6"/>
   </w:num>
   <w:num w:numId="3" w16cid:durableId="66728811">
-    <w:abstractNumId w:val="1"/>
+    <w:abstractNumId w:val="2"/>
   </w:num>
   <w:num w:numId="4" w16cid:durableId="1899319696">
     <w:abstractNumId w:val="0"/>
   </w:num>
   <w:num w:numId="5" w16cid:durableId="243498299">
-    <w:abstractNumId w:val="3"/>
+    <w:abstractNumId w:val="5"/>
+  </w:num>
+  <w:num w:numId="6" w16cid:durableId="934481322">
+    <w:abstractNumId w:val="8"/>
+  </w:num>
+  <w:num w:numId="7" w16cid:durableId="369259466">
+    <w:abstractNumId w:val="4"/>
+  </w:num>
+  <w:num w:numId="8" w16cid:durableId="992754457">
+    <w:abstractNumId w:val="7"/>
+  </w:num>
+  <w:num w:numId="9" w16cid:durableId="1039204814">
+    <w:abstractNumId w:val="1"/>
   </w:num>
 </w:numbering>
 </file>
@@ -2605,7 +3436,6 @@
     <w:next w:val="Normal"/>
     <w:link w:val="Heading2Char"/>
     <w:uiPriority w:val="9"/>
-    <w:semiHidden/>
     <w:unhideWhenUsed/>
     <w:qFormat/>
     <w:rsid w:val="00FC05D3"/>
@@ -2821,7 +3651,6 @@
     <w:basedOn w:val="DefaultParagraphFont"/>
     <w:link w:val="Heading2"/>
     <w:uiPriority w:val="9"/>
-    <w:semiHidden/>
     <w:rsid w:val="00FC05D3"/>
     <w:rPr>
       <w:rFonts w:asciiTheme="majorHAnsi" w:eastAsiaTheme="majorEastAsia" w:hAnsiTheme="majorHAnsi" w:cstheme="majorBidi"/>

</xml_diff>